<commit_message>
Updated report with confusion matrix and accuracy graphs
</commit_message>
<xml_diff>
--- a/reports/capstone_mnist_cnn_project_report_updated.docx
+++ b/reports/capstone_mnist_cnn_project_report_updated.docx
@@ -2524,6 +2524,195 @@
         </w:rPr>
       </w:r>
     </w:p>
+    <w:tbl>
+      <w:tblPr>
+        <w:tblStyle w:val="Table4"/>
+        <w:tblW w:w="10944.0" w:type="dxa"/>
+        <w:jc w:val="left"/>
+        <w:tblBorders>
+          <w:top w:color="000000" w:space="0" w:sz="8" w:val="single"/>
+          <w:left w:color="000000" w:space="0" w:sz="8" w:val="single"/>
+          <w:bottom w:color="000000" w:space="0" w:sz="8" w:val="single"/>
+          <w:right w:color="000000" w:space="0" w:sz="8" w:val="single"/>
+          <w:insideH w:color="000000" w:space="0" w:sz="8" w:val="single"/>
+          <w:insideV w:color="000000" w:space="0" w:sz="8" w:val="single"/>
+        </w:tblBorders>
+        <w:tblLayout w:type="fixed"/>
+        <w:tblLook w:val="0600"/>
+      </w:tblPr>
+      <w:tblGrid>
+        <w:gridCol w:w="5472"/>
+        <w:gridCol w:w="5472"/>
+        <w:tblGridChange w:id="0">
+          <w:tblGrid>
+            <w:gridCol w:w="5472"/>
+            <w:gridCol w:w="5472"/>
+          </w:tblGrid>
+        </w:tblGridChange>
+      </w:tblGrid>
+      <w:tr>
+        <w:trPr>
+          <w:cantSplit w:val="0"/>
+          <w:tblHeader w:val="0"/>
+        </w:trPr>
+        <w:tc>
+          <w:tcPr>
+            <w:shd w:fill="auto" w:val="clear"/>
+            <w:tcMar>
+              <w:top w:w="100.0" w:type="dxa"/>
+              <w:left w:w="100.0" w:type="dxa"/>
+              <w:bottom w:w="100.0" w:type="dxa"/>
+              <w:right w:w="100.0" w:type="dxa"/>
+            </w:tcMar>
+            <w:vAlign w:val="top"/>
+          </w:tcPr>
+          <w:p>
+            <w:pPr>
+              <w:keepNext w:val="0"/>
+              <w:keepLines w:val="0"/>
+              <w:pageBreakBefore w:val="0"/>
+              <w:widowControl w:val="0"/>
+              <w:pBdr>
+                <w:top w:space="0" w:sz="0" w:val="nil"/>
+                <w:left w:space="0" w:sz="0" w:val="nil"/>
+                <w:bottom w:space="0" w:sz="0" w:val="nil"/>
+                <w:right w:space="0" w:sz="0" w:val="nil"/>
+                <w:between w:space="0" w:sz="0" w:val="nil"/>
+              </w:pBdr>
+              <w:shd w:fill="auto" w:val="clear"/>
+              <w:spacing w:after="0" w:before="0" w:line="240" w:lineRule="auto"/>
+              <w:ind w:left="0" w:right="0" w:firstLine="0"/>
+              <w:jc w:val="left"/>
+              <w:rPr>
+                <w:sz w:val="20"/>
+                <w:szCs w:val="20"/>
+              </w:rPr>
+            </w:pPr>
+            <w:r>
+              <w:rPr>
+                <w:sz w:val="20"/>
+                <w:szCs w:val="20"/>
+              </w:rPr>
+              <w:drawing>
+                <wp:inline distB="114300" distT="114300" distL="114300" distR="114300">
+                  <wp:extent cx="3333750" cy="2057400"/>
+                  <wp:effectExtent b="0" l="0" r="0" t="0"/>
+                  <wp:docPr id="3" name="image2.png"/>
+                  <a:graphic>
+                    <a:graphicData uri="http://schemas.openxmlformats.org/drawingml/2006/picture">
+                      <pic:pic>
+                        <pic:nvPicPr>
+                          <pic:cNvPr id="0" name="image2.png"/>
+                          <pic:cNvPicPr preferRelativeResize="0"/>
+                        </pic:nvPicPr>
+                        <pic:blipFill>
+                          <a:blip r:embed="rId6"/>
+                          <a:srcRect b="0" l="0" r="0" t="0"/>
+                          <a:stretch>
+                            <a:fillRect/>
+                          </a:stretch>
+                        </pic:blipFill>
+                        <pic:spPr>
+                          <a:xfrm>
+                            <a:off x="0" y="0"/>
+                            <a:ext cx="3333750" cy="2057400"/>
+                          </a:xfrm>
+                          <a:prstGeom prst="rect"/>
+                          <a:ln/>
+                        </pic:spPr>
+                      </pic:pic>
+                    </a:graphicData>
+                  </a:graphic>
+                </wp:inline>
+              </w:drawing>
+            </w:r>
+            <w:r>
+              <w:rPr>
+                <w:rtl w:val="0"/>
+              </w:rPr>
+            </w:r>
+          </w:p>
+        </w:tc>
+        <w:tc>
+          <w:tcPr>
+            <w:shd w:fill="auto" w:val="clear"/>
+            <w:tcMar>
+              <w:top w:w="100.0" w:type="dxa"/>
+              <w:left w:w="100.0" w:type="dxa"/>
+              <w:bottom w:w="100.0" w:type="dxa"/>
+              <w:right w:w="100.0" w:type="dxa"/>
+            </w:tcMar>
+            <w:vAlign w:val="top"/>
+          </w:tcPr>
+          <w:p>
+            <w:pPr>
+              <w:keepNext w:val="0"/>
+              <w:keepLines w:val="0"/>
+              <w:pageBreakBefore w:val="0"/>
+              <w:widowControl w:val="0"/>
+              <w:pBdr>
+                <w:top w:space="0" w:sz="0" w:val="nil"/>
+                <w:left w:space="0" w:sz="0" w:val="nil"/>
+                <w:bottom w:space="0" w:sz="0" w:val="nil"/>
+                <w:right w:space="0" w:sz="0" w:val="nil"/>
+                <w:between w:space="0" w:sz="0" w:val="nil"/>
+              </w:pBdr>
+              <w:shd w:fill="auto" w:val="clear"/>
+              <w:spacing w:after="0" w:before="0" w:line="240" w:lineRule="auto"/>
+              <w:ind w:left="0" w:right="0" w:firstLine="0"/>
+              <w:jc w:val="left"/>
+              <w:rPr>
+                <w:sz w:val="20"/>
+                <w:szCs w:val="20"/>
+              </w:rPr>
+            </w:pPr>
+            <w:r>
+              <w:rPr>
+                <w:sz w:val="20"/>
+                <w:szCs w:val="20"/>
+              </w:rPr>
+              <w:drawing>
+                <wp:inline distB="114300" distT="114300" distL="114300" distR="114300">
+                  <wp:extent cx="3333750" cy="2057400"/>
+                  <wp:effectExtent b="0" l="0" r="0" t="0"/>
+                  <wp:docPr id="1" name="image3.png"/>
+                  <a:graphic>
+                    <a:graphicData uri="http://schemas.openxmlformats.org/drawingml/2006/picture">
+                      <pic:pic>
+                        <pic:nvPicPr>
+                          <pic:cNvPr id="0" name="image3.png"/>
+                          <pic:cNvPicPr preferRelativeResize="0"/>
+                        </pic:nvPicPr>
+                        <pic:blipFill>
+                          <a:blip r:embed="rId7"/>
+                          <a:srcRect b="0" l="0" r="0" t="0"/>
+                          <a:stretch>
+                            <a:fillRect/>
+                          </a:stretch>
+                        </pic:blipFill>
+                        <pic:spPr>
+                          <a:xfrm>
+                            <a:off x="0" y="0"/>
+                            <a:ext cx="3333750" cy="2057400"/>
+                          </a:xfrm>
+                          <a:prstGeom prst="rect"/>
+                          <a:ln/>
+                        </pic:spPr>
+                      </pic:pic>
+                    </a:graphicData>
+                  </a:graphic>
+                </wp:inline>
+              </w:drawing>
+            </w:r>
+            <w:r>
+              <w:rPr>
+                <w:rtl w:val="0"/>
+              </w:rPr>
+            </w:r>
+          </w:p>
+        </w:tc>
+      </w:tr>
+    </w:tbl>
     <w:p>
       <w:pPr>
         <w:spacing w:after="20" w:before="0" w:line="240" w:lineRule="auto"/>
@@ -2535,11 +2724,144 @@
       </w:pPr>
       <w:r>
         <w:rPr>
+          <w:rtl w:val="0"/>
+        </w:rPr>
+      </w:r>
+    </w:p>
+    <w:p>
+      <w:pPr>
+        <w:spacing w:after="20" w:before="0" w:line="240" w:lineRule="auto"/>
+        <w:ind w:firstLine="720"/>
+        <w:jc w:val="both"/>
+        <w:rPr>
           <w:sz w:val="20"/>
           <w:szCs w:val="20"/>
+        </w:rPr>
+      </w:pPr>
+      <w:r>
+        <w:rPr>
+          <w:sz w:val="20"/>
+          <w:szCs w:val="20"/>
+        </w:rPr>
+        <w:drawing>
+          <wp:inline distB="114300" distT="114300" distL="114300" distR="114300">
+            <wp:extent cx="5746433" cy="2705100"/>
+            <wp:effectExtent b="0" l="0" r="0" t="0"/>
+            <wp:docPr id="2" name="image1.png"/>
+            <a:graphic>
+              <a:graphicData uri="http://schemas.openxmlformats.org/drawingml/2006/picture">
+                <pic:pic>
+                  <pic:nvPicPr>
+                    <pic:cNvPr id="0" name="image1.png"/>
+                    <pic:cNvPicPr preferRelativeResize="0"/>
+                  </pic:nvPicPr>
+                  <pic:blipFill>
+                    <a:blip r:embed="rId8"/>
+                    <a:srcRect b="0" l="0" r="0" t="0"/>
+                    <a:stretch>
+                      <a:fillRect/>
+                    </a:stretch>
+                  </pic:blipFill>
+                  <pic:spPr>
+                    <a:xfrm>
+                      <a:off x="0" y="0"/>
+                      <a:ext cx="5746433" cy="2705100"/>
+                    </a:xfrm>
+                    <a:prstGeom prst="rect"/>
+                    <a:ln/>
+                  </pic:spPr>
+                </pic:pic>
+              </a:graphicData>
+            </a:graphic>
+          </wp:inline>
+        </w:drawing>
+      </w:r>
+      <w:r>
+        <w:rPr>
+          <w:rtl w:val="0"/>
+        </w:rPr>
+      </w:r>
+    </w:p>
+    <w:p>
+      <w:pPr>
+        <w:spacing w:after="20" w:before="0" w:line="240" w:lineRule="auto"/>
+        <w:jc w:val="both"/>
+        <w:rPr>
+          <w:sz w:val="20"/>
+          <w:szCs w:val="20"/>
+        </w:rPr>
+      </w:pPr>
+      <w:r>
+        <w:rPr>
+          <w:rtl w:val="0"/>
+        </w:rPr>
+      </w:r>
+    </w:p>
+    <w:p>
+      <w:pPr>
+        <w:spacing w:after="20" w:before="0" w:line="240" w:lineRule="auto"/>
+        <w:jc w:val="both"/>
+        <w:rPr>
+          <w:sz w:val="20"/>
+          <w:szCs w:val="20"/>
+        </w:rPr>
+      </w:pPr>
+      <w:r>
+        <w:rPr>
+          <w:rtl w:val="0"/>
+        </w:rPr>
+      </w:r>
+    </w:p>
+    <w:p>
+      <w:pPr>
+        <w:spacing w:after="20" w:before="0" w:line="240" w:lineRule="auto"/>
+        <w:jc w:val="both"/>
+        <w:rPr>
+          <w:sz w:val="20"/>
+          <w:szCs w:val="20"/>
+        </w:rPr>
+      </w:pPr>
+      <w:r>
+        <w:rPr>
+          <w:sz w:val="20"/>
+          <w:szCs w:val="20"/>
           <w:rtl w:val="0"/>
         </w:rPr>
         <w:t xml:space="preserve">The approach works well because MNIST is clean, centered, grayscale, and relatively simple. However, performance on real external images may vary if the digit is not centered, has noise, uses a different background color, or differs from MNIST writing style. The prediction pipeline therefore converts custom images to grayscale, resizes them to 28×28, normalizes pixels, and optionally inverts colors.</w:t>
+      </w:r>
+    </w:p>
+    <w:p>
+      <w:pPr>
+        <w:spacing w:after="20" w:before="60" w:lineRule="auto"/>
+        <w:rPr>
+          <w:color w:val="1f4e79"/>
+          <w:sz w:val="22"/>
+          <w:szCs w:val="22"/>
+        </w:rPr>
+      </w:pPr>
+      <w:r>
+        <w:rPr>
+          <w:rtl w:val="0"/>
+        </w:rPr>
+      </w:r>
+    </w:p>
+    <w:p>
+      <w:pPr>
+        <w:spacing w:after="20" w:before="60" w:lineRule="auto"/>
+        <w:rPr>
+          <w:b w:val="1"/>
+          <w:bCs w:val="1"/>
+          <w:color w:val="1f4e79"/>
+        </w:rPr>
+      </w:pPr>
+      <w:r>
+        <w:rPr>
+          <w:b w:val="1"/>
+          <w:bCs w:val="1"/>
+          <w:color w:val="1f4e79"/>
+          <w:rtl w:val="0"/>
+        </w:rPr>
+        <w:t xml:space="preserve">7. Explicit Alignment with Project Evaluation Procedure</w:t>
       </w:r>
     </w:p>
     <w:p>
@@ -2559,62 +2881,9 @@
         </w:rPr>
       </w:r>
     </w:p>
-    <w:p>
-      <w:pPr>
-        <w:spacing w:after="20" w:before="60" w:lineRule="auto"/>
-        <w:rPr>
-          <w:b w:val="1"/>
-          <w:bCs w:val="1"/>
-          <w:color w:val="1f4e79"/>
-          <w:sz w:val="22"/>
-          <w:szCs w:val="22"/>
-        </w:rPr>
-      </w:pPr>
-      <w:r>
-        <w:rPr>
-          <w:rtl w:val="0"/>
-        </w:rPr>
-      </w:r>
-    </w:p>
-    <w:p>
-      <w:pPr>
-        <w:spacing w:after="20" w:before="60" w:lineRule="auto"/>
-        <w:rPr>
-          <w:b w:val="1"/>
-          <w:bCs w:val="1"/>
-          <w:color w:val="1f4e79"/>
-        </w:rPr>
-      </w:pPr>
-      <w:r>
-        <w:rPr>
-          <w:b w:val="1"/>
-          <w:bCs w:val="1"/>
-          <w:color w:val="1f4e79"/>
-          <w:rtl w:val="0"/>
-        </w:rPr>
-        <w:t xml:space="preserve">7. Explicit Alignment with Project Evaluation Procedure</w:t>
-      </w:r>
-    </w:p>
-    <w:p>
-      <w:pPr>
-        <w:spacing w:after="20" w:before="60" w:lineRule="auto"/>
-        <w:rPr>
-          <w:b w:val="1"/>
-          <w:bCs w:val="1"/>
-          <w:color w:val="1f4e79"/>
-          <w:sz w:val="22"/>
-          <w:szCs w:val="22"/>
-        </w:rPr>
-      </w:pPr>
-      <w:r>
-        <w:rPr>
-          <w:rtl w:val="0"/>
-        </w:rPr>
-      </w:r>
-    </w:p>
     <w:tbl>
       <w:tblPr>
-        <w:tblStyle w:val="Table4"/>
+        <w:tblStyle w:val="Table5"/>
         <w:tblW w:w="10944.0" w:type="dxa"/>
         <w:jc w:val="center"/>
         <w:tblBorders>
@@ -3144,19 +3413,6 @@
       <w:pPr>
         <w:spacing w:after="20" w:before="60" w:lineRule="auto"/>
         <w:rPr>
-          <w:color w:val="1f4e79"/>
-        </w:rPr>
-      </w:pPr>
-      <w:r>
-        <w:rPr>
-          <w:rtl w:val="0"/>
-        </w:rPr>
-      </w:r>
-    </w:p>
-    <w:p>
-      <w:pPr>
-        <w:spacing w:after="20" w:before="60" w:lineRule="auto"/>
-        <w:rPr>
           <w:b w:val="1"/>
           <w:bCs w:val="1"/>
           <w:color w:val="1f4e79"/>
@@ -3360,7 +3616,7 @@
       </w:r>
     </w:p>
     <w:sectPr>
-      <w:footerReference r:id="rId6" w:type="default"/>
+      <w:footerReference r:id="rId9" w:type="default"/>
       <w:pgSz w:h="15840" w:w="12240" w:orient="portrait"/>
       <w:pgMar w:bottom="547" w:top="547" w:left="648" w:right="648" w:header="720" w:footer="720"/>
       <w:pgNumType w:start="1"/>
@@ -3375,7 +3631,6 @@
     <w:pPr>
       <w:keepNext w:val="0"/>
       <w:keepLines w:val="0"/>
-      <w:pageBreakBefore w:val="0"/>
       <w:widowControl w:val="1"/>
       <w:pBdr>
         <w:top w:space="0" w:sz="0" w:val="nil"/>
@@ -3654,6 +3909,13 @@
     </w:tblPr>
   </w:style>
   <w:style w:type="table" w:styleId="Table4">
+    <w:basedOn w:val="TableNormal"/>
+    <w:tblPr>
+      <w:tblStyleRowBandSize w:val="1"/>
+      <w:tblStyleColBandSize w:val="1"/>
+    </w:tblPr>
+  </w:style>
+  <w:style w:type="table" w:styleId="Table5">
     <w:basedOn w:val="TableNormal"/>
     <w:pPr>
       <w:spacing w:after="0" w:line="240" w:lineRule="auto"/>

</xml_diff>